<commit_message>
docs(hubspot): calendário das jornadas finais e lead quente antecipado
Calendário do plano passa a seguir as jornadas finais (1, 2A e 2B).
Lead quente: apresentação da pré-certificação antecipada de 20/10 para 16/10.

Co-Authored-By: Claude Opus 5.5 <noreply@anthropic.com>
Claude-Session: https://claude.ai/code/session_015RbXfDxmNawpBWPtJf9ZpF
</commit_message>
<xml_diff>
--- a/docs/hubspot/Plano_Comunicacao_Outubro_Mind.docx
+++ b/docs/hubspot/Plano_Comunicacao_Outubro_Mind.docx
@@ -32,7 +32,7 @@
           <w:sz w:val="20"/>
           <w:szCs w:val="20"/>
         </w:rPr>
-        <w:t xml:space="preserve">Mind · pré-certificação (aulas de 3 a 5/11) · campanha de 05 a 27/10 · versão de 05/10/2026 · 13.619 contatos</w:t>
+        <w:t xml:space="preserve">Mind · pré-certificação (aulas de 3 a 5/11) · campanha de 05 a 27/10 · versão de 16/10/2026 (tamanhos de 05/10) · 13.619 contatos</w:t>
       </w:r>
     </w:p>
     <w:p>
@@ -1603,7 +1603,7 @@
           <w:sz w:val="20"/>
           <w:szCs w:val="20"/>
         </w:rPr>
-        <w:t xml:space="preserve">C1 e C2 são camadas da "Jornada Mind 3 Camadas"; "Consultiva" é a "Jornada Pré-Certificação Consultiva".</w:t>
+        <w:t xml:space="preserve">Calendário das jornadas finais: "Jornada 1 — Já viveu o Mind" e "Jornada 2 — Consultiva | Leads" (2A Lead quente e 2B Lead frio). Lista 3: o envio de 08/10 sai em lotes, e quem já recebeu 5+ e-mails sem reagir e não abrir 08 e 15/10 sai da régua.</w:t>
       </w:r>
     </w:p>
     <w:tbl>
@@ -1620,10 +1620,9 @@
       </w:tblPr>
       <w:tblGrid>
         <w:gridCol w:w="1300"/>
-        <w:gridCol w:w="3200"/>
-        <w:gridCol w:w="3400"/>
-        <w:gridCol w:w="3600"/>
-        <w:gridCol w:w="3070"/>
+        <w:gridCol w:w="4200"/>
+        <w:gridCol w:w="4500"/>
+        <w:gridCol w:w="4570"/>
       </w:tblGrid>
       <w:tr>
         <w:trPr>
@@ -1659,7 +1658,7 @@
         </w:tc>
         <w:tc>
           <w:tcPr>
-            <w:tcW w:type="dxa" w:w="3200"/>
+            <w:tcW w:type="dxa" w:w="4200"/>
             <w:shd w:fill="1F4E79" w:color="auto" w:val="clear"/>
             <w:tcMar>
               <w:top w:type="dxa" w:w="60"/>
@@ -1681,13 +1680,13 @@
                 <w:sz w:val="18"/>
                 <w:szCs w:val="18"/>
               </w:rPr>
-              <w:t xml:space="preserve">Lista 1 · Já viveu o Mind</w:t>
-            </w:r>
-          </w:p>
-        </w:tc>
-        <w:tc>
-          <w:tcPr>
-            <w:tcW w:type="dxa" w:w="3400"/>
+              <w:t xml:space="preserve">Lista 1 · Já viveu o Mind (Jornada 1)</w:t>
+            </w:r>
+          </w:p>
+        </w:tc>
+        <w:tc>
+          <w:tcPr>
+            <w:tcW w:type="dxa" w:w="4500"/>
             <w:shd w:fill="1F4E79" w:color="auto" w:val="clear"/>
             <w:tcMar>
               <w:top w:type="dxa" w:w="60"/>
@@ -1709,13 +1708,13 @@
                 <w:sz w:val="18"/>
                 <w:szCs w:val="18"/>
               </w:rPr>
-              <w:t xml:space="preserve">Lista 2 · Lead quente</w:t>
-            </w:r>
-          </w:p>
-        </w:tc>
-        <w:tc>
-          <w:tcPr>
-            <w:tcW w:type="dxa" w:w="3600"/>
+              <w:t xml:space="preserve">Lista 2 · Lead quente (Jornada 2A)</w:t>
+            </w:r>
+          </w:p>
+        </w:tc>
+        <w:tc>
+          <w:tcPr>
+            <w:tcW w:type="dxa" w:w="4570"/>
             <w:shd w:fill="1F4E79" w:color="auto" w:val="clear"/>
             <w:tcMar>
               <w:top w:type="dxa" w:w="60"/>
@@ -1737,35 +1736,7 @@
                 <w:sz w:val="18"/>
                 <w:szCs w:val="18"/>
               </w:rPr>
-              <w:t xml:space="preserve">Lista 3 · Lead frio · nunca comunicado</w:t>
-            </w:r>
-          </w:p>
-        </w:tc>
-        <w:tc>
-          <w:tcPr>
-            <w:tcW w:type="dxa" w:w="3070"/>
-            <w:shd w:fill="1F4E79" w:color="auto" w:val="clear"/>
-            <w:tcMar>
-              <w:top w:type="dxa" w:w="60"/>
-              <w:left w:type="dxa" w:w="90"/>
-              <w:bottom w:type="dxa" w:w="60"/>
-              <w:right w:type="dxa" w:w="90"/>
-            </w:tcMar>
-          </w:tcPr>
-          <w:p>
-            <w:pPr>
-              <w:spacing w:after="40"/>
-            </w:pPr>
-            <w:r>
-              <w:rPr>
-                <w:rFonts w:ascii="Calibri" w:cs="Calibri" w:eastAsia="Calibri" w:hAnsi="Calibri"/>
-                <w:b/>
-                <w:bCs/>
-                <w:color w:val="FFFFFF"/>
-                <w:sz w:val="18"/>
-                <w:szCs w:val="18"/>
-              </w:rPr>
-              <w:t xml:space="preserve">Lista 3 · Lead frio · já recebeu 5+ sem reagir</w:t>
+              <w:t xml:space="preserve">Lista 3 · Lead frio (Jornada 2B)</w:t>
             </w:r>
           </w:p>
         </w:tc>
@@ -1792,31 +1763,31 @@
                 <w:sz w:val="18"/>
                 <w:szCs w:val="18"/>
               </w:rPr>
-              <w:t xml:space="preserve">05/10</w:t>
-            </w:r>
-          </w:p>
-        </w:tc>
-        <w:tc>
-          <w:tcPr>
-            <w:tcW w:type="dxa" w:w="3200"/>
-            <w:tcMar>
-              <w:top w:type="dxa" w:w="60"/>
-              <w:left w:type="dxa" w:w="90"/>
-              <w:bottom w:type="dxa" w:w="60"/>
-              <w:right w:type="dxa" w:w="90"/>
-            </w:tcMar>
-          </w:tcPr>
-          <w:p>
-            <w:pPr>
-              <w:spacing w:after="40"/>
-            </w:pPr>
-            <w:r>
-              <w:rPr>
-                <w:rFonts w:ascii="Calibri" w:cs="Calibri" w:eastAsia="Calibri" w:hAnsi="Calibri"/>
-                <w:sz w:val="18"/>
-                <w:szCs w:val="18"/>
-              </w:rPr>
-              <w:t xml:space="preserve">C2 · Abertura</w:t>
+              <w:t xml:space="preserve">06/10</w:t>
+            </w:r>
+          </w:p>
+        </w:tc>
+        <w:tc>
+          <w:tcPr>
+            <w:tcW w:type="dxa" w:w="4200"/>
+            <w:tcMar>
+              <w:top w:type="dxa" w:w="60"/>
+              <w:left w:type="dxa" w:w="90"/>
+              <w:bottom w:type="dxa" w:w="60"/>
+              <w:right w:type="dxa" w:w="90"/>
+            </w:tcMar>
+          </w:tcPr>
+          <w:p>
+            <w:pPr>
+              <w:spacing w:after="40"/>
+            </w:pPr>
+            <w:r>
+              <w:rPr>
+                <w:rFonts w:ascii="Calibri" w:cs="Calibri" w:eastAsia="Calibri" w:hAnsi="Calibri"/>
+                <w:sz w:val="18"/>
+                <w:szCs w:val="18"/>
+              </w:rPr>
+              <w:t xml:space="preserve">Pós-Summit + ecossistema</w:t>
             </w:r>
           </w:p>
           <w:p>
@@ -1835,25 +1806,25 @@
         </w:tc>
         <w:tc>
           <w:tcPr>
-            <w:tcW w:type="dxa" w:w="3400"/>
-            <w:tcMar>
-              <w:top w:type="dxa" w:w="60"/>
-              <w:left w:type="dxa" w:w="90"/>
-              <w:bottom w:type="dxa" w:w="60"/>
-              <w:right w:type="dxa" w:w="90"/>
-            </w:tcMar>
-          </w:tcPr>
-          <w:p>
-            <w:pPr>
-              <w:spacing w:after="40"/>
-            </w:pPr>
-            <w:r>
-              <w:rPr>
-                <w:rFonts w:ascii="Calibri" w:cs="Calibri" w:eastAsia="Calibri" w:hAnsi="Calibri"/>
-                <w:sz w:val="18"/>
-                <w:szCs w:val="18"/>
-              </w:rPr>
-              <w:t xml:space="preserve">Consultiva · Abertura · começar pelo desafio</w:t>
+            <w:tcW w:type="dxa" w:w="4500"/>
+            <w:tcMar>
+              <w:top w:type="dxa" w:w="60"/>
+              <w:left w:type="dxa" w:w="90"/>
+              <w:bottom w:type="dxa" w:w="60"/>
+              <w:right w:type="dxa" w:w="90"/>
+            </w:tcMar>
+          </w:tcPr>
+          <w:p>
+            <w:pPr>
+              <w:spacing w:after="40"/>
+            </w:pPr>
+            <w:r>
+              <w:rPr>
+                <w:rFonts w:ascii="Calibri" w:cs="Calibri" w:eastAsia="Calibri" w:hAnsi="Calibri"/>
+                <w:sz w:val="18"/>
+                <w:szCs w:val="18"/>
+              </w:rPr>
+              <w:t xml:space="preserve">Ecossistema Mind</w:t>
             </w:r>
           </w:p>
           <w:p>
@@ -1872,49 +1843,25 @@
         </w:tc>
         <w:tc>
           <w:tcPr>
-            <w:tcW w:type="dxa" w:w="3600"/>
-            <w:tcMar>
-              <w:top w:type="dxa" w:w="60"/>
-              <w:left w:type="dxa" w:w="90"/>
-              <w:bottom w:type="dxa" w:w="60"/>
-              <w:right w:type="dxa" w:w="90"/>
-            </w:tcMar>
-          </w:tcPr>
-          <w:p>
-            <w:pPr>
-              <w:spacing w:after="40"/>
-            </w:pPr>
-            <w:r>
-              <w:rPr>
-                <w:rFonts w:ascii="Calibri" w:cs="Calibri" w:eastAsia="Calibri" w:hAnsi="Calibri"/>
-                <w:sz w:val="18"/>
-                <w:szCs w:val="18"/>
-              </w:rPr>
-              <w:t xml:space="preserve">Lote 1: C1 Abertura</w:t>
-            </w:r>
-          </w:p>
-        </w:tc>
-        <w:tc>
-          <w:tcPr>
-            <w:tcW w:type="dxa" w:w="3070"/>
-            <w:tcMar>
-              <w:top w:type="dxa" w:w="60"/>
-              <w:left w:type="dxa" w:w="90"/>
-              <w:bottom w:type="dxa" w:w="60"/>
-              <w:right w:type="dxa" w:w="90"/>
-            </w:tcMar>
-          </w:tcPr>
-          <w:p>
-            <w:pPr>
-              <w:spacing w:after="40"/>
-            </w:pPr>
-            <w:r>
-              <w:rPr>
-                <w:rFonts w:ascii="Calibri" w:cs="Calibri" w:eastAsia="Calibri" w:hAnsi="Calibri"/>
-                <w:sz w:val="18"/>
-                <w:szCs w:val="18"/>
-              </w:rPr>
-              <w:t xml:space="preserve">Reativação: C1 Abertura</w:t>
+            <w:tcW w:type="dxa" w:w="4570"/>
+            <w:tcMar>
+              <w:top w:type="dxa" w:w="60"/>
+              <w:left w:type="dxa" w:w="90"/>
+              <w:bottom w:type="dxa" w:w="60"/>
+              <w:right w:type="dxa" w:w="90"/>
+            </w:tcMar>
+          </w:tcPr>
+          <w:p>
+            <w:pPr>
+              <w:spacing w:after="40"/>
+            </w:pPr>
+            <w:r>
+              <w:rPr>
+                <w:rFonts w:ascii="Calibri" w:cs="Calibri" w:eastAsia="Calibri" w:hAnsi="Calibri"/>
+                <w:sz w:val="18"/>
+                <w:szCs w:val="18"/>
+              </w:rPr>
+              <w:t xml:space="preserve">—</w:t>
             </w:r>
           </w:p>
         </w:tc>
@@ -1941,124 +1888,13 @@
                 <w:sz w:val="18"/>
                 <w:szCs w:val="18"/>
               </w:rPr>
-              <w:t xml:space="preserve">07/10</w:t>
-            </w:r>
-          </w:p>
-        </w:tc>
-        <w:tc>
-          <w:tcPr>
-            <w:tcW w:type="dxa" w:w="3200"/>
-            <w:tcMar>
-              <w:top w:type="dxa" w:w="60"/>
-              <w:left w:type="dxa" w:w="90"/>
-              <w:bottom w:type="dxa" w:w="60"/>
-              <w:right w:type="dxa" w:w="90"/>
-            </w:tcMar>
-          </w:tcPr>
-          <w:p>
-            <w:pPr>
-              <w:spacing w:after="40"/>
-            </w:pPr>
-            <w:r>
-              <w:rPr>
-                <w:rFonts w:ascii="Calibri" w:cs="Calibri" w:eastAsia="Calibri" w:hAnsi="Calibri"/>
-                <w:sz w:val="18"/>
-                <w:szCs w:val="18"/>
-              </w:rPr>
-              <w:t xml:space="preserve">C2 · Construção de valor</w:t>
-            </w:r>
-          </w:p>
-          <w:p>
-            <w:pPr>
-              <w:spacing w:after="40"/>
-            </w:pPr>
-            <w:r>
-              <w:rPr>
-                <w:rFonts w:ascii="Calibri" w:cs="Calibri" w:eastAsia="Calibri" w:hAnsi="Calibri"/>
-                <w:sz w:val="18"/>
-                <w:szCs w:val="18"/>
-              </w:rPr>
-              <w:t xml:space="preserve">e-mail</w:t>
-            </w:r>
-          </w:p>
-        </w:tc>
-        <w:tc>
-          <w:tcPr>
-            <w:tcW w:type="dxa" w:w="3400"/>
-            <w:tcMar>
-              <w:top w:type="dxa" w:w="60"/>
-              <w:left w:type="dxa" w:w="90"/>
-              <w:bottom w:type="dxa" w:w="60"/>
-              <w:right w:type="dxa" w:w="90"/>
-            </w:tcMar>
-          </w:tcPr>
-          <w:p>
-            <w:pPr>
-              <w:spacing w:after="40"/>
-            </w:pPr>
-            <w:r>
-              <w:rPr>
-                <w:rFonts w:ascii="Calibri" w:cs="Calibri" w:eastAsia="Calibri" w:hAnsi="Calibri"/>
-                <w:sz w:val="18"/>
-                <w:szCs w:val="18"/>
-              </w:rPr>
-              <w:t xml:space="preserve">Consultiva · Construção de valor</w:t>
-            </w:r>
-          </w:p>
-          <w:p>
-            <w:pPr>
-              <w:spacing w:after="40"/>
-            </w:pPr>
-            <w:r>
-              <w:rPr>
-                <w:rFonts w:ascii="Calibri" w:cs="Calibri" w:eastAsia="Calibri" w:hAnsi="Calibri"/>
-                <w:sz w:val="18"/>
-                <w:szCs w:val="18"/>
-              </w:rPr>
-              <w:t xml:space="preserve">e-mail</w:t>
-            </w:r>
-          </w:p>
-        </w:tc>
-        <w:tc>
-          <w:tcPr>
-            <w:tcW w:type="dxa" w:w="3600"/>
-            <w:tcMar>
-              <w:top w:type="dxa" w:w="60"/>
-              <w:left w:type="dxa" w:w="90"/>
-              <w:bottom w:type="dxa" w:w="60"/>
-              <w:right w:type="dxa" w:w="90"/>
-            </w:tcMar>
-          </w:tcPr>
-          <w:p>
-            <w:pPr>
-              <w:spacing w:after="40"/>
-            </w:pPr>
-            <w:r>
-              <w:rPr>
-                <w:rFonts w:ascii="Calibri" w:cs="Calibri" w:eastAsia="Calibri" w:hAnsi="Calibri"/>
-                <w:sz w:val="18"/>
-                <w:szCs w:val="18"/>
-              </w:rPr>
-              <w:t xml:space="preserve">Lote 1: C1 Construção de valor</w:t>
-            </w:r>
-          </w:p>
-          <w:p>
-            <w:pPr>
-              <w:spacing w:after="40"/>
-            </w:pPr>
-            <w:r>
-              <w:rPr>
-                <w:rFonts w:ascii="Calibri" w:cs="Calibri" w:eastAsia="Calibri" w:hAnsi="Calibri"/>
-                <w:sz w:val="18"/>
-                <w:szCs w:val="18"/>
-              </w:rPr>
-              <w:t xml:space="preserve">Lote 2: C1 Abertura</w:t>
-            </w:r>
-          </w:p>
-        </w:tc>
-        <w:tc>
-          <w:tcPr>
-            <w:tcW w:type="dxa" w:w="3070"/>
+              <w:t xml:space="preserve">08/10</w:t>
+            </w:r>
+          </w:p>
+        </w:tc>
+        <w:tc>
+          <w:tcPr>
+            <w:tcW w:type="dxa" w:w="4200"/>
             <w:tcMar>
               <w:top w:type="dxa" w:w="60"/>
               <w:left w:type="dxa" w:w="90"/>
@@ -2077,6 +1913,67 @@
                 <w:szCs w:val="18"/>
               </w:rPr>
               <w:t xml:space="preserve">—</w:t>
+            </w:r>
+          </w:p>
+        </w:tc>
+        <w:tc>
+          <w:tcPr>
+            <w:tcW w:type="dxa" w:w="4500"/>
+            <w:tcMar>
+              <w:top w:type="dxa" w:w="60"/>
+              <w:left w:type="dxa" w:w="90"/>
+              <w:bottom w:type="dxa" w:w="60"/>
+              <w:right w:type="dxa" w:w="90"/>
+            </w:tcMar>
+          </w:tcPr>
+          <w:p>
+            <w:pPr>
+              <w:spacing w:after="40"/>
+            </w:pPr>
+            <w:r>
+              <w:rPr>
+                <w:rFonts w:ascii="Calibri" w:cs="Calibri" w:eastAsia="Calibri" w:hAnsi="Calibri"/>
+                <w:sz w:val="18"/>
+                <w:szCs w:val="18"/>
+              </w:rPr>
+              <w:t xml:space="preserve">—</w:t>
+            </w:r>
+          </w:p>
+        </w:tc>
+        <w:tc>
+          <w:tcPr>
+            <w:tcW w:type="dxa" w:w="4570"/>
+            <w:tcMar>
+              <w:top w:type="dxa" w:w="60"/>
+              <w:left w:type="dxa" w:w="90"/>
+              <w:bottom w:type="dxa" w:w="60"/>
+              <w:right w:type="dxa" w:w="90"/>
+            </w:tcMar>
+          </w:tcPr>
+          <w:p>
+            <w:pPr>
+              <w:spacing w:after="40"/>
+            </w:pPr>
+            <w:r>
+              <w:rPr>
+                <w:rFonts w:ascii="Calibri" w:cs="Calibri" w:eastAsia="Calibri" w:hAnsi="Calibri"/>
+                <w:sz w:val="18"/>
+                <w:szCs w:val="18"/>
+              </w:rPr>
+              <w:t xml:space="preserve">Prazer, somos o Mind</w:t>
+            </w:r>
+          </w:p>
+          <w:p>
+            <w:pPr>
+              <w:spacing w:after="40"/>
+            </w:pPr>
+            <w:r>
+              <w:rPr>
+                <w:rFonts w:ascii="Calibri" w:cs="Calibri" w:eastAsia="Calibri" w:hAnsi="Calibri"/>
+                <w:sz w:val="18"/>
+                <w:szCs w:val="18"/>
+              </w:rPr>
+              <w:t xml:space="preserve">e-mail · WhatsApp só para quem já conhece a Mind</w:t>
             </w:r>
           </w:p>
         </w:tc>
@@ -2103,68 +2000,31 @@
                 <w:sz w:val="18"/>
                 <w:szCs w:val="18"/>
               </w:rPr>
-              <w:t xml:space="preserve">09/10</w:t>
-            </w:r>
-          </w:p>
-        </w:tc>
-        <w:tc>
-          <w:tcPr>
-            <w:tcW w:type="dxa" w:w="3200"/>
-            <w:tcMar>
-              <w:top w:type="dxa" w:w="60"/>
-              <w:left w:type="dxa" w:w="90"/>
-              <w:bottom w:type="dxa" w:w="60"/>
-              <w:right w:type="dxa" w:w="90"/>
-            </w:tcMar>
-          </w:tcPr>
-          <w:p>
-            <w:pPr>
-              <w:spacing w:after="40"/>
-            </w:pPr>
-            <w:r>
-              <w:rPr>
-                <w:rFonts w:ascii="Calibri" w:cs="Calibri" w:eastAsia="Calibri" w:hAnsi="Calibri"/>
-                <w:sz w:val="18"/>
-                <w:szCs w:val="18"/>
-              </w:rPr>
-              <w:t xml:space="preserve">C2 · Autodiagnóstico</w:t>
-            </w:r>
-          </w:p>
-          <w:p>
-            <w:pPr>
-              <w:spacing w:after="40"/>
-            </w:pPr>
-            <w:r>
-              <w:rPr>
-                <w:rFonts w:ascii="Calibri" w:cs="Calibri" w:eastAsia="Calibri" w:hAnsi="Calibri"/>
-                <w:sz w:val="18"/>
-                <w:szCs w:val="18"/>
-              </w:rPr>
-              <w:t xml:space="preserve">e-mail</w:t>
-            </w:r>
-          </w:p>
-        </w:tc>
-        <w:tc>
-          <w:tcPr>
-            <w:tcW w:type="dxa" w:w="3400"/>
-            <w:tcMar>
-              <w:top w:type="dxa" w:w="60"/>
-              <w:left w:type="dxa" w:w="90"/>
-              <w:bottom w:type="dxa" w:w="60"/>
-              <w:right w:type="dxa" w:w="90"/>
-            </w:tcMar>
-          </w:tcPr>
-          <w:p>
-            <w:pPr>
-              <w:spacing w:after="40"/>
-            </w:pPr>
-            <w:r>
-              <w:rPr>
-                <w:rFonts w:ascii="Calibri" w:cs="Calibri" w:eastAsia="Calibri" w:hAnsi="Calibri"/>
-                <w:sz w:val="18"/>
-                <w:szCs w:val="18"/>
-              </w:rPr>
-              <w:t xml:space="preserve">Consultiva · Apresentação das jornadas</w:t>
+              <w:t xml:space="preserve">13/10</w:t>
+            </w:r>
+          </w:p>
+        </w:tc>
+        <w:tc>
+          <w:tcPr>
+            <w:tcW w:type="dxa" w:w="4200"/>
+            <w:tcMar>
+              <w:top w:type="dxa" w:w="60"/>
+              <w:left w:type="dxa" w:w="90"/>
+              <w:bottom w:type="dxa" w:w="60"/>
+              <w:right w:type="dxa" w:w="90"/>
+            </w:tcMar>
+          </w:tcPr>
+          <w:p>
+            <w:pPr>
+              <w:spacing w:after="40"/>
+            </w:pPr>
+            <w:r>
+              <w:rPr>
+                <w:rFonts w:ascii="Calibri" w:cs="Calibri" w:eastAsia="Calibri" w:hAnsi="Calibri"/>
+                <w:sz w:val="18"/>
+                <w:szCs w:val="18"/>
+              </w:rPr>
+              <w:t xml:space="preserve">Autodiagnóstico</w:t>
             </w:r>
           </w:p>
           <w:p>
@@ -2183,57 +2043,31 @@
         </w:tc>
         <w:tc>
           <w:tcPr>
-            <w:tcW w:type="dxa" w:w="3600"/>
-            <w:tcMar>
-              <w:top w:type="dxa" w:w="60"/>
-              <w:left w:type="dxa" w:w="90"/>
-              <w:bottom w:type="dxa" w:w="60"/>
-              <w:right w:type="dxa" w:w="90"/>
-            </w:tcMar>
-          </w:tcPr>
-          <w:p>
-            <w:pPr>
-              <w:spacing w:after="40"/>
-            </w:pPr>
-            <w:r>
-              <w:rPr>
-                <w:rFonts w:ascii="Calibri" w:cs="Calibri" w:eastAsia="Calibri" w:hAnsi="Calibri"/>
-                <w:sz w:val="18"/>
-                <w:szCs w:val="18"/>
-              </w:rPr>
-              <w:t xml:space="preserve">Lote 1: C1 Autodiagnóstico</w:t>
-            </w:r>
-          </w:p>
-          <w:p>
-            <w:pPr>
-              <w:spacing w:after="40"/>
-            </w:pPr>
-            <w:r>
-              <w:rPr>
-                <w:rFonts w:ascii="Calibri" w:cs="Calibri" w:eastAsia="Calibri" w:hAnsi="Calibri"/>
-                <w:sz w:val="18"/>
-                <w:szCs w:val="18"/>
-              </w:rPr>
-              <w:t xml:space="preserve">Lote 2: C1 Construção de valor</w:t>
-            </w:r>
-          </w:p>
-          <w:p>
-            <w:pPr>
-              <w:spacing w:after="40"/>
-            </w:pPr>
-            <w:r>
-              <w:rPr>
-                <w:rFonts w:ascii="Calibri" w:cs="Calibri" w:eastAsia="Calibri" w:hAnsi="Calibri"/>
-                <w:sz w:val="18"/>
-                <w:szCs w:val="18"/>
-              </w:rPr>
-              <w:t xml:space="preserve">Lote 3: C1 Abertura</w:t>
-            </w:r>
-          </w:p>
-        </w:tc>
-        <w:tc>
-          <w:tcPr>
-            <w:tcW w:type="dxa" w:w="3070"/>
+            <w:tcW w:type="dxa" w:w="4500"/>
+            <w:tcMar>
+              <w:top w:type="dxa" w:w="60"/>
+              <w:left w:type="dxa" w:w="90"/>
+              <w:bottom w:type="dxa" w:w="60"/>
+              <w:right w:type="dxa" w:w="90"/>
+            </w:tcMar>
+          </w:tcPr>
+          <w:p>
+            <w:pPr>
+              <w:spacing w:after="40"/>
+            </w:pPr>
+            <w:r>
+              <w:rPr>
+                <w:rFonts w:ascii="Calibri" w:cs="Calibri" w:eastAsia="Calibri" w:hAnsi="Calibri"/>
+                <w:sz w:val="18"/>
+                <w:szCs w:val="18"/>
+              </w:rPr>
+              <w:t xml:space="preserve">—</w:t>
+            </w:r>
+          </w:p>
+        </w:tc>
+        <w:tc>
+          <w:tcPr>
+            <w:tcW w:type="dxa" w:w="4570"/>
             <w:tcMar>
               <w:top w:type="dxa" w:w="60"/>
               <w:left w:type="dxa" w:w="90"/>
@@ -2278,111 +2112,74 @@
                 <w:sz w:val="18"/>
                 <w:szCs w:val="18"/>
               </w:rPr>
-              <w:t xml:space="preserve">13/10</w:t>
-            </w:r>
-          </w:p>
-        </w:tc>
-        <w:tc>
-          <w:tcPr>
-            <w:tcW w:type="dxa" w:w="3200"/>
-            <w:tcMar>
-              <w:top w:type="dxa" w:w="60"/>
-              <w:left w:type="dxa" w:w="90"/>
-              <w:bottom w:type="dxa" w:w="60"/>
-              <w:right w:type="dxa" w:w="90"/>
-            </w:tcMar>
-          </w:tcPr>
-          <w:p>
-            <w:pPr>
-              <w:spacing w:after="40"/>
-            </w:pPr>
-            <w:r>
-              <w:rPr>
-                <w:rFonts w:ascii="Calibri" w:cs="Calibri" w:eastAsia="Calibri" w:hAnsi="Calibri"/>
-                <w:sz w:val="18"/>
-                <w:szCs w:val="18"/>
-              </w:rPr>
-              <w:t xml:space="preserve">C2 · 3 dimensões</w:t>
-            </w:r>
-          </w:p>
-          <w:p>
-            <w:pPr>
-              <w:spacing w:after="40"/>
-            </w:pPr>
-            <w:r>
-              <w:rPr>
-                <w:rFonts w:ascii="Calibri" w:cs="Calibri" w:eastAsia="Calibri" w:hAnsi="Calibri"/>
-                <w:sz w:val="18"/>
-                <w:szCs w:val="18"/>
-              </w:rPr>
-              <w:t xml:space="preserve">e-mail</w:t>
-            </w:r>
-          </w:p>
-        </w:tc>
-        <w:tc>
-          <w:tcPr>
-            <w:tcW w:type="dxa" w:w="3400"/>
-            <w:tcMar>
-              <w:top w:type="dxa" w:w="60"/>
-              <w:left w:type="dxa" w:w="90"/>
-              <w:bottom w:type="dxa" w:w="60"/>
-              <w:right w:type="dxa" w:w="90"/>
-            </w:tcMar>
-          </w:tcPr>
-          <w:p>
-            <w:pPr>
-              <w:spacing w:after="40"/>
-            </w:pPr>
-            <w:r>
-              <w:rPr>
-                <w:rFonts w:ascii="Calibri" w:cs="Calibri" w:eastAsia="Calibri" w:hAnsi="Calibri"/>
-                <w:sz w:val="18"/>
-                <w:szCs w:val="18"/>
-              </w:rPr>
-              <w:t xml:space="preserve">Consultiva · Benefícios</w:t>
-            </w:r>
-          </w:p>
-          <w:p>
-            <w:pPr>
-              <w:spacing w:after="40"/>
-            </w:pPr>
-            <w:r>
-              <w:rPr>
-                <w:rFonts w:ascii="Calibri" w:cs="Calibri" w:eastAsia="Calibri" w:hAnsi="Calibri"/>
-                <w:sz w:val="18"/>
-                <w:szCs w:val="18"/>
-              </w:rPr>
-              <w:t xml:space="preserve">e-mail</w:t>
-            </w:r>
-          </w:p>
-        </w:tc>
-        <w:tc>
-          <w:tcPr>
-            <w:tcW w:type="dxa" w:w="3600"/>
-            <w:tcMar>
-              <w:top w:type="dxa" w:w="60"/>
-              <w:left w:type="dxa" w:w="90"/>
-              <w:bottom w:type="dxa" w:w="60"/>
-              <w:right w:type="dxa" w:w="90"/>
-            </w:tcMar>
-          </w:tcPr>
-          <w:p>
-            <w:pPr>
-              <w:spacing w:after="40"/>
-            </w:pPr>
-            <w:r>
-              <w:rPr>
-                <w:rFonts w:ascii="Calibri" w:cs="Calibri" w:eastAsia="Calibri" w:hAnsi="Calibri"/>
-                <w:sz w:val="18"/>
-                <w:szCs w:val="18"/>
-              </w:rPr>
-              <w:t xml:space="preserve">C1 3 dimensões (todos os lotes)</w:t>
-            </w:r>
-          </w:p>
-        </w:tc>
-        <w:tc>
-          <w:tcPr>
-            <w:tcW w:type="dxa" w:w="3070"/>
+              <w:t xml:space="preserve">14/10</w:t>
+            </w:r>
+          </w:p>
+        </w:tc>
+        <w:tc>
+          <w:tcPr>
+            <w:tcW w:type="dxa" w:w="4200"/>
+            <w:tcMar>
+              <w:top w:type="dxa" w:w="60"/>
+              <w:left w:type="dxa" w:w="90"/>
+              <w:bottom w:type="dxa" w:w="60"/>
+              <w:right w:type="dxa" w:w="90"/>
+            </w:tcMar>
+          </w:tcPr>
+          <w:p>
+            <w:pPr>
+              <w:spacing w:after="40"/>
+            </w:pPr>
+            <w:r>
+              <w:rPr>
+                <w:rFonts w:ascii="Calibri" w:cs="Calibri" w:eastAsia="Calibri" w:hAnsi="Calibri"/>
+                <w:sz w:val="18"/>
+                <w:szCs w:val="18"/>
+              </w:rPr>
+              <w:t xml:space="preserve">—</w:t>
+            </w:r>
+          </w:p>
+        </w:tc>
+        <w:tc>
+          <w:tcPr>
+            <w:tcW w:type="dxa" w:w="4500"/>
+            <w:tcMar>
+              <w:top w:type="dxa" w:w="60"/>
+              <w:left w:type="dxa" w:w="90"/>
+              <w:bottom w:type="dxa" w:w="60"/>
+              <w:right w:type="dxa" w:w="90"/>
+            </w:tcMar>
+          </w:tcPr>
+          <w:p>
+            <w:pPr>
+              <w:spacing w:after="40"/>
+            </w:pPr>
+            <w:r>
+              <w:rPr>
+                <w:rFonts w:ascii="Calibri" w:cs="Calibri" w:eastAsia="Calibri" w:hAnsi="Calibri"/>
+                <w:sz w:val="18"/>
+                <w:szCs w:val="18"/>
+              </w:rPr>
+              <w:t xml:space="preserve">Autodiagnóstico</w:t>
+            </w:r>
+          </w:p>
+          <w:p>
+            <w:pPr>
+              <w:spacing w:after="40"/>
+            </w:pPr>
+            <w:r>
+              <w:rPr>
+                <w:rFonts w:ascii="Calibri" w:cs="Calibri" w:eastAsia="Calibri" w:hAnsi="Calibri"/>
+                <w:sz w:val="18"/>
+                <w:szCs w:val="18"/>
+              </w:rPr>
+              <w:t xml:space="preserve">e-mail + WhatsApp</w:t>
+            </w:r>
+          </w:p>
+        </w:tc>
+        <w:tc>
+          <w:tcPr>
+            <w:tcW w:type="dxa" w:w="4570"/>
             <w:tcMar>
               <w:top w:type="dxa" w:w="60"/>
               <w:left w:type="dxa" w:w="90"/>
@@ -2427,111 +2224,13 @@
                 <w:sz w:val="18"/>
                 <w:szCs w:val="18"/>
               </w:rPr>
-              <w:t xml:space="preserve">16/10</w:t>
-            </w:r>
-          </w:p>
-        </w:tc>
-        <w:tc>
-          <w:tcPr>
-            <w:tcW w:type="dxa" w:w="3200"/>
-            <w:tcMar>
-              <w:top w:type="dxa" w:w="60"/>
-              <w:left w:type="dxa" w:w="90"/>
-              <w:bottom w:type="dxa" w:w="60"/>
-              <w:right w:type="dxa" w:w="90"/>
-            </w:tcMar>
-          </w:tcPr>
-          <w:p>
-            <w:pPr>
-              <w:spacing w:after="40"/>
-            </w:pPr>
-            <w:r>
-              <w:rPr>
-                <w:rFonts w:ascii="Calibri" w:cs="Calibri" w:eastAsia="Calibri" w:hAnsi="Calibri"/>
-                <w:sz w:val="18"/>
-                <w:szCs w:val="18"/>
-              </w:rPr>
-              <w:t xml:space="preserve">C2 · Especialistas + conteúdo</w:t>
-            </w:r>
-          </w:p>
-          <w:p>
-            <w:pPr>
-              <w:spacing w:after="40"/>
-            </w:pPr>
-            <w:r>
-              <w:rPr>
-                <w:rFonts w:ascii="Calibri" w:cs="Calibri" w:eastAsia="Calibri" w:hAnsi="Calibri"/>
-                <w:sz w:val="18"/>
-                <w:szCs w:val="18"/>
-              </w:rPr>
-              <w:t xml:space="preserve">e-mail</w:t>
-            </w:r>
-          </w:p>
-        </w:tc>
-        <w:tc>
-          <w:tcPr>
-            <w:tcW w:type="dxa" w:w="3400"/>
-            <w:tcMar>
-              <w:top w:type="dxa" w:w="60"/>
-              <w:left w:type="dxa" w:w="90"/>
-              <w:bottom w:type="dxa" w:w="60"/>
-              <w:right w:type="dxa" w:w="90"/>
-            </w:tcMar>
-          </w:tcPr>
-          <w:p>
-            <w:pPr>
-              <w:spacing w:after="40"/>
-            </w:pPr>
-            <w:r>
-              <w:rPr>
-                <w:rFonts w:ascii="Calibri" w:cs="Calibri" w:eastAsia="Calibri" w:hAnsi="Calibri"/>
-                <w:sz w:val="18"/>
-                <w:szCs w:val="18"/>
-              </w:rPr>
-              <w:t xml:space="preserve">Consultiva · Diagnóstico</w:t>
-            </w:r>
-          </w:p>
-          <w:p>
-            <w:pPr>
-              <w:spacing w:after="40"/>
-            </w:pPr>
-            <w:r>
-              <w:rPr>
-                <w:rFonts w:ascii="Calibri" w:cs="Calibri" w:eastAsia="Calibri" w:hAnsi="Calibri"/>
-                <w:sz w:val="18"/>
-                <w:szCs w:val="18"/>
-              </w:rPr>
-              <w:t xml:space="preserve">e-mail + WhatsApp</w:t>
-            </w:r>
-          </w:p>
-        </w:tc>
-        <w:tc>
-          <w:tcPr>
-            <w:tcW w:type="dxa" w:w="3600"/>
-            <w:tcMar>
-              <w:top w:type="dxa" w:w="60"/>
-              <w:left w:type="dxa" w:w="90"/>
-              <w:bottom w:type="dxa" w:w="60"/>
-              <w:right w:type="dxa" w:w="90"/>
-            </w:tcMar>
-          </w:tcPr>
-          <w:p>
-            <w:pPr>
-              <w:spacing w:after="40"/>
-            </w:pPr>
-            <w:r>
-              <w:rPr>
-                <w:rFonts w:ascii="Calibri" w:cs="Calibri" w:eastAsia="Calibri" w:hAnsi="Calibri"/>
-                <w:sz w:val="18"/>
-                <w:szCs w:val="18"/>
-              </w:rPr>
-              <w:t xml:space="preserve">C1 Especialistas + conteúdo (todos os lotes)</w:t>
-            </w:r>
-          </w:p>
-        </w:tc>
-        <w:tc>
-          <w:tcPr>
-            <w:tcW w:type="dxa" w:w="3070"/>
+              <w:t xml:space="preserve">15/10</w:t>
+            </w:r>
+          </w:p>
+        </w:tc>
+        <w:tc>
+          <w:tcPr>
+            <w:tcW w:type="dxa" w:w="4200"/>
             <w:tcMar>
               <w:top w:type="dxa" w:w="60"/>
               <w:left w:type="dxa" w:w="90"/>
@@ -2550,6 +2249,67 @@
                 <w:szCs w:val="18"/>
               </w:rPr>
               <w:t xml:space="preserve">—</w:t>
+            </w:r>
+          </w:p>
+        </w:tc>
+        <w:tc>
+          <w:tcPr>
+            <w:tcW w:type="dxa" w:w="4500"/>
+            <w:tcMar>
+              <w:top w:type="dxa" w:w="60"/>
+              <w:left w:type="dxa" w:w="90"/>
+              <w:bottom w:type="dxa" w:w="60"/>
+              <w:right w:type="dxa" w:w="90"/>
+            </w:tcMar>
+          </w:tcPr>
+          <w:p>
+            <w:pPr>
+              <w:spacing w:after="40"/>
+            </w:pPr>
+            <w:r>
+              <w:rPr>
+                <w:rFonts w:ascii="Calibri" w:cs="Calibri" w:eastAsia="Calibri" w:hAnsi="Calibri"/>
+                <w:sz w:val="18"/>
+                <w:szCs w:val="18"/>
+              </w:rPr>
+              <w:t xml:space="preserve">—</w:t>
+            </w:r>
+          </w:p>
+        </w:tc>
+        <w:tc>
+          <w:tcPr>
+            <w:tcW w:type="dxa" w:w="4570"/>
+            <w:tcMar>
+              <w:top w:type="dxa" w:w="60"/>
+              <w:left w:type="dxa" w:w="90"/>
+              <w:bottom w:type="dxa" w:w="60"/>
+              <w:right w:type="dxa" w:w="90"/>
+            </w:tcMar>
+          </w:tcPr>
+          <w:p>
+            <w:pPr>
+              <w:spacing w:after="40"/>
+            </w:pPr>
+            <w:r>
+              <w:rPr>
+                <w:rFonts w:ascii="Calibri" w:cs="Calibri" w:eastAsia="Calibri" w:hAnsi="Calibri"/>
+                <w:sz w:val="18"/>
+                <w:szCs w:val="18"/>
+              </w:rPr>
+              <w:t xml:space="preserve">Diagnóstico</w:t>
+            </w:r>
+          </w:p>
+          <w:p>
+            <w:pPr>
+              <w:spacing w:after="40"/>
+            </w:pPr>
+            <w:r>
+              <w:rPr>
+                <w:rFonts w:ascii="Calibri" w:cs="Calibri" w:eastAsia="Calibri" w:hAnsi="Calibri"/>
+                <w:sz w:val="18"/>
+                <w:szCs w:val="18"/>
+              </w:rPr>
+              <w:t xml:space="preserve">e-mail · WhatsApp só para quem já conhece a Mind</w:t>
             </w:r>
           </w:p>
         </w:tc>
@@ -2576,111 +2336,74 @@
                 <w:sz w:val="18"/>
                 <w:szCs w:val="18"/>
               </w:rPr>
-              <w:t xml:space="preserve">20/10</w:t>
-            </w:r>
-          </w:p>
-        </w:tc>
-        <w:tc>
-          <w:tcPr>
-            <w:tcW w:type="dxa" w:w="3200"/>
-            <w:tcMar>
-              <w:top w:type="dxa" w:w="60"/>
-              <w:left w:type="dxa" w:w="90"/>
-              <w:bottom w:type="dxa" w:w="60"/>
-              <w:right w:type="dxa" w:w="90"/>
-            </w:tcMar>
-          </w:tcPr>
-          <w:p>
-            <w:pPr>
-              <w:spacing w:after="40"/>
-            </w:pPr>
-            <w:r>
-              <w:rPr>
-                <w:rFonts w:ascii="Calibri" w:cs="Calibri" w:eastAsia="Calibri" w:hAnsi="Calibri"/>
-                <w:sz w:val="18"/>
-                <w:szCs w:val="18"/>
-              </w:rPr>
-              <w:t xml:space="preserve">C2 · Ajudar a escolher</w:t>
-            </w:r>
-          </w:p>
-          <w:p>
-            <w:pPr>
-              <w:spacing w:after="40"/>
-            </w:pPr>
-            <w:r>
-              <w:rPr>
-                <w:rFonts w:ascii="Calibri" w:cs="Calibri" w:eastAsia="Calibri" w:hAnsi="Calibri"/>
-                <w:sz w:val="18"/>
-                <w:szCs w:val="18"/>
-              </w:rPr>
-              <w:t xml:space="preserve">e-mail</w:t>
-            </w:r>
-          </w:p>
-        </w:tc>
-        <w:tc>
-          <w:tcPr>
-            <w:tcW w:type="dxa" w:w="3400"/>
-            <w:tcMar>
-              <w:top w:type="dxa" w:w="60"/>
-              <w:left w:type="dxa" w:w="90"/>
-              <w:bottom w:type="dxa" w:w="60"/>
-              <w:right w:type="dxa" w:w="90"/>
-            </w:tcMar>
-          </w:tcPr>
-          <w:p>
-            <w:pPr>
-              <w:spacing w:after="40"/>
-            </w:pPr>
-            <w:r>
-              <w:rPr>
-                <w:rFonts w:ascii="Calibri" w:cs="Calibri" w:eastAsia="Calibri" w:hAnsi="Calibri"/>
-                <w:sz w:val="18"/>
-                <w:szCs w:val="18"/>
-              </w:rPr>
-              <w:t xml:space="preserve">Consultiva · Aprofundamento</w:t>
-            </w:r>
-          </w:p>
-          <w:p>
-            <w:pPr>
-              <w:spacing w:after="40"/>
-            </w:pPr>
-            <w:r>
-              <w:rPr>
-                <w:rFonts w:ascii="Calibri" w:cs="Calibri" w:eastAsia="Calibri" w:hAnsi="Calibri"/>
-                <w:sz w:val="18"/>
-                <w:szCs w:val="18"/>
-              </w:rPr>
-              <w:t xml:space="preserve">e-mail</w:t>
-            </w:r>
-          </w:p>
-        </w:tc>
-        <w:tc>
-          <w:tcPr>
-            <w:tcW w:type="dxa" w:w="3600"/>
-            <w:tcMar>
-              <w:top w:type="dxa" w:w="60"/>
-              <w:left w:type="dxa" w:w="90"/>
-              <w:bottom w:type="dxa" w:w="60"/>
-              <w:right w:type="dxa" w:w="90"/>
-            </w:tcMar>
-          </w:tcPr>
-          <w:p>
-            <w:pPr>
-              <w:spacing w:after="40"/>
-            </w:pPr>
-            <w:r>
-              <w:rPr>
-                <w:rFonts w:ascii="Calibri" w:cs="Calibri" w:eastAsia="Calibri" w:hAnsi="Calibri"/>
-                <w:sz w:val="18"/>
-                <w:szCs w:val="18"/>
-              </w:rPr>
-              <w:t xml:space="preserve">C1 Ajudar a escolher (todos os lotes)</w:t>
-            </w:r>
-          </w:p>
-        </w:tc>
-        <w:tc>
-          <w:tcPr>
-            <w:tcW w:type="dxa" w:w="3070"/>
+              <w:t xml:space="preserve">16/10</w:t>
+            </w:r>
+          </w:p>
+        </w:tc>
+        <w:tc>
+          <w:tcPr>
+            <w:tcW w:type="dxa" w:w="4200"/>
+            <w:tcMar>
+              <w:top w:type="dxa" w:w="60"/>
+              <w:left w:type="dxa" w:w="90"/>
+              <w:bottom w:type="dxa" w:w="60"/>
+              <w:right w:type="dxa" w:w="90"/>
+            </w:tcMar>
+          </w:tcPr>
+          <w:p>
+            <w:pPr>
+              <w:spacing w:after="40"/>
+            </w:pPr>
+            <w:r>
+              <w:rPr>
+                <w:rFonts w:ascii="Calibri" w:cs="Calibri" w:eastAsia="Calibri" w:hAnsi="Calibri"/>
+                <w:sz w:val="18"/>
+                <w:szCs w:val="18"/>
+              </w:rPr>
+              <w:t xml:space="preserve">—</w:t>
+            </w:r>
+          </w:p>
+        </w:tc>
+        <w:tc>
+          <w:tcPr>
+            <w:tcW w:type="dxa" w:w="4500"/>
+            <w:tcMar>
+              <w:top w:type="dxa" w:w="60"/>
+              <w:left w:type="dxa" w:w="90"/>
+              <w:bottom w:type="dxa" w:w="60"/>
+              <w:right w:type="dxa" w:w="90"/>
+            </w:tcMar>
+          </w:tcPr>
+          <w:p>
+            <w:pPr>
+              <w:spacing w:after="40"/>
+            </w:pPr>
+            <w:r>
+              <w:rPr>
+                <w:rFonts w:ascii="Calibri" w:cs="Calibri" w:eastAsia="Calibri" w:hAnsi="Calibri"/>
+                <w:sz w:val="18"/>
+                <w:szCs w:val="18"/>
+              </w:rPr>
+              <w:t xml:space="preserve">Apresentação da pré-certificação (antecipada de 20/10)</w:t>
+            </w:r>
+          </w:p>
+          <w:p>
+            <w:pPr>
+              <w:spacing w:after="40"/>
+            </w:pPr>
+            <w:r>
+              <w:rPr>
+                <w:rFonts w:ascii="Calibri" w:cs="Calibri" w:eastAsia="Calibri" w:hAnsi="Calibri"/>
+                <w:sz w:val="18"/>
+                <w:szCs w:val="18"/>
+              </w:rPr>
+              <w:t xml:space="preserve">e-mail + WhatsApp</w:t>
+            </w:r>
+          </w:p>
+        </w:tc>
+        <w:tc>
+          <w:tcPr>
+            <w:tcW w:type="dxa" w:w="4570"/>
             <w:tcMar>
               <w:top w:type="dxa" w:w="60"/>
               <w:left w:type="dxa" w:w="90"/>
@@ -2725,31 +2448,31 @@
                 <w:sz w:val="18"/>
                 <w:szCs w:val="18"/>
               </w:rPr>
-              <w:t xml:space="preserve">23/10</w:t>
-            </w:r>
-          </w:p>
-        </w:tc>
-        <w:tc>
-          <w:tcPr>
-            <w:tcW w:type="dxa" w:w="3200"/>
-            <w:tcMar>
-              <w:top w:type="dxa" w:w="60"/>
-              <w:left w:type="dxa" w:w="90"/>
-              <w:bottom w:type="dxa" w:w="60"/>
-              <w:right w:type="dxa" w:w="90"/>
-            </w:tcMar>
-          </w:tcPr>
-          <w:p>
-            <w:pPr>
-              <w:spacing w:after="40"/>
-            </w:pPr>
-            <w:r>
-              <w:rPr>
-                <w:rFonts w:ascii="Calibri" w:cs="Calibri" w:eastAsia="Calibri" w:hAnsi="Calibri"/>
-                <w:sz w:val="18"/>
-                <w:szCs w:val="18"/>
-              </w:rPr>
-              <w:t xml:space="preserve">C2 · Oferta</w:t>
+              <w:t xml:space="preserve">20/10</w:t>
+            </w:r>
+          </w:p>
+        </w:tc>
+        <w:tc>
+          <w:tcPr>
+            <w:tcW w:type="dxa" w:w="4200"/>
+            <w:tcMar>
+              <w:top w:type="dxa" w:w="60"/>
+              <w:left w:type="dxa" w:w="90"/>
+              <w:bottom w:type="dxa" w:w="60"/>
+              <w:right w:type="dxa" w:w="90"/>
+            </w:tcMar>
+          </w:tcPr>
+          <w:p>
+            <w:pPr>
+              <w:spacing w:after="40"/>
+            </w:pPr>
+            <w:r>
+              <w:rPr>
+                <w:rFonts w:ascii="Calibri" w:cs="Calibri" w:eastAsia="Calibri" w:hAnsi="Calibri"/>
+                <w:sz w:val="18"/>
+                <w:szCs w:val="18"/>
+              </w:rPr>
+              <w:t xml:space="preserve">Apresentação da pré-certificação</w:t>
             </w:r>
           </w:p>
           <w:p>
@@ -2768,86 +2491,49 @@
         </w:tc>
         <w:tc>
           <w:tcPr>
-            <w:tcW w:type="dxa" w:w="3400"/>
-            <w:tcMar>
-              <w:top w:type="dxa" w:w="60"/>
-              <w:left w:type="dxa" w:w="90"/>
-              <w:bottom w:type="dxa" w:w="60"/>
-              <w:right w:type="dxa" w:w="90"/>
-            </w:tcMar>
-          </w:tcPr>
-          <w:p>
-            <w:pPr>
-              <w:spacing w:after="40"/>
-            </w:pPr>
-            <w:r>
-              <w:rPr>
-                <w:rFonts w:ascii="Calibri" w:cs="Calibri" w:eastAsia="Calibri" w:hAnsi="Calibri"/>
-                <w:sz w:val="18"/>
-                <w:szCs w:val="18"/>
-              </w:rPr>
-              <w:t xml:space="preserve">Consultiva · Quebra de objeções</w:t>
-            </w:r>
-          </w:p>
-          <w:p>
-            <w:pPr>
-              <w:spacing w:after="40"/>
-            </w:pPr>
-            <w:r>
-              <w:rPr>
-                <w:rFonts w:ascii="Calibri" w:cs="Calibri" w:eastAsia="Calibri" w:hAnsi="Calibri"/>
-                <w:sz w:val="18"/>
-                <w:szCs w:val="18"/>
-              </w:rPr>
-              <w:t xml:space="preserve">e-mail + WhatsApp</w:t>
-            </w:r>
-          </w:p>
-        </w:tc>
-        <w:tc>
-          <w:tcPr>
-            <w:tcW w:type="dxa" w:w="3600"/>
-            <w:tcMar>
-              <w:top w:type="dxa" w:w="60"/>
-              <w:left w:type="dxa" w:w="90"/>
-              <w:bottom w:type="dxa" w:w="60"/>
-              <w:right w:type="dxa" w:w="90"/>
-            </w:tcMar>
-          </w:tcPr>
-          <w:p>
-            <w:pPr>
-              <w:spacing w:after="40"/>
-            </w:pPr>
-            <w:r>
-              <w:rPr>
-                <w:rFonts w:ascii="Calibri" w:cs="Calibri" w:eastAsia="Calibri" w:hAnsi="Calibri"/>
-                <w:sz w:val="18"/>
-                <w:szCs w:val="18"/>
-              </w:rPr>
-              <w:t xml:space="preserve">C1 Oferta (todos os lotes)</w:t>
-            </w:r>
-          </w:p>
-        </w:tc>
-        <w:tc>
-          <w:tcPr>
-            <w:tcW w:type="dxa" w:w="3070"/>
-            <w:tcMar>
-              <w:top w:type="dxa" w:w="60"/>
-              <w:left w:type="dxa" w:w="90"/>
-              <w:bottom w:type="dxa" w:w="60"/>
-              <w:right w:type="dxa" w:w="90"/>
-            </w:tcMar>
-          </w:tcPr>
-          <w:p>
-            <w:pPr>
-              <w:spacing w:after="40"/>
-            </w:pPr>
-            <w:r>
-              <w:rPr>
-                <w:rFonts w:ascii="Calibri" w:cs="Calibri" w:eastAsia="Calibri" w:hAnsi="Calibri"/>
-                <w:sz w:val="18"/>
-                <w:szCs w:val="18"/>
-              </w:rPr>
-              <w:t xml:space="preserve">C1 Oferta</w:t>
+            <w:tcW w:type="dxa" w:w="4500"/>
+            <w:tcMar>
+              <w:top w:type="dxa" w:w="60"/>
+              <w:left w:type="dxa" w:w="90"/>
+              <w:bottom w:type="dxa" w:w="60"/>
+              <w:right w:type="dxa" w:w="90"/>
+            </w:tcMar>
+          </w:tcPr>
+          <w:p>
+            <w:pPr>
+              <w:spacing w:after="40"/>
+            </w:pPr>
+            <w:r>
+              <w:rPr>
+                <w:rFonts w:ascii="Calibri" w:cs="Calibri" w:eastAsia="Calibri" w:hAnsi="Calibri"/>
+                <w:sz w:val="18"/>
+                <w:szCs w:val="18"/>
+              </w:rPr>
+              <w:t xml:space="preserve">—</w:t>
+            </w:r>
+          </w:p>
+        </w:tc>
+        <w:tc>
+          <w:tcPr>
+            <w:tcW w:type="dxa" w:w="4570"/>
+            <w:tcMar>
+              <w:top w:type="dxa" w:w="60"/>
+              <w:left w:type="dxa" w:w="90"/>
+              <w:bottom w:type="dxa" w:w="60"/>
+              <w:right w:type="dxa" w:w="90"/>
+            </w:tcMar>
+          </w:tcPr>
+          <w:p>
+            <w:pPr>
+              <w:spacing w:after="40"/>
+            </w:pPr>
+            <w:r>
+              <w:rPr>
+                <w:rFonts w:ascii="Calibri" w:cs="Calibri" w:eastAsia="Calibri" w:hAnsi="Calibri"/>
+                <w:sz w:val="18"/>
+                <w:szCs w:val="18"/>
+              </w:rPr>
+              <w:t xml:space="preserve">—</w:t>
             </w:r>
           </w:p>
         </w:tc>
@@ -2874,111 +2560,13 @@
                 <w:sz w:val="18"/>
                 <w:szCs w:val="18"/>
               </w:rPr>
-              <w:t xml:space="preserve">26/10</w:t>
-            </w:r>
-          </w:p>
-        </w:tc>
-        <w:tc>
-          <w:tcPr>
-            <w:tcW w:type="dxa" w:w="3200"/>
-            <w:tcMar>
-              <w:top w:type="dxa" w:w="60"/>
-              <w:left w:type="dxa" w:w="90"/>
-              <w:bottom w:type="dxa" w:w="60"/>
-              <w:right w:type="dxa" w:w="90"/>
-            </w:tcMar>
-          </w:tcPr>
-          <w:p>
-            <w:pPr>
-              <w:spacing w:after="40"/>
-            </w:pPr>
-            <w:r>
-              <w:rPr>
-                <w:rFonts w:ascii="Calibri" w:cs="Calibri" w:eastAsia="Calibri" w:hAnsi="Calibri"/>
-                <w:sz w:val="18"/>
-                <w:szCs w:val="18"/>
-              </w:rPr>
-              <w:t xml:space="preserve">C2 · Últimos dias</w:t>
-            </w:r>
-          </w:p>
-          <w:p>
-            <w:pPr>
-              <w:spacing w:after="40"/>
-            </w:pPr>
-            <w:r>
-              <w:rPr>
-                <w:rFonts w:ascii="Calibri" w:cs="Calibri" w:eastAsia="Calibri" w:hAnsi="Calibri"/>
-                <w:sz w:val="18"/>
-                <w:szCs w:val="18"/>
-              </w:rPr>
-              <w:t xml:space="preserve">e-mail</w:t>
-            </w:r>
-          </w:p>
-        </w:tc>
-        <w:tc>
-          <w:tcPr>
-            <w:tcW w:type="dxa" w:w="3400"/>
-            <w:tcMar>
-              <w:top w:type="dxa" w:w="60"/>
-              <w:left w:type="dxa" w:w="90"/>
-              <w:bottom w:type="dxa" w:w="60"/>
-              <w:right w:type="dxa" w:w="90"/>
-            </w:tcMar>
-          </w:tcPr>
-          <w:p>
-            <w:pPr>
-              <w:spacing w:after="40"/>
-            </w:pPr>
-            <w:r>
-              <w:rPr>
-                <w:rFonts w:ascii="Calibri" w:cs="Calibri" w:eastAsia="Calibri" w:hAnsi="Calibri"/>
-                <w:sz w:val="18"/>
-                <w:szCs w:val="18"/>
-              </w:rPr>
-              <w:t xml:space="preserve">Consultiva · Últimos dias</w:t>
-            </w:r>
-          </w:p>
-          <w:p>
-            <w:pPr>
-              <w:spacing w:after="40"/>
-            </w:pPr>
-            <w:r>
-              <w:rPr>
-                <w:rFonts w:ascii="Calibri" w:cs="Calibri" w:eastAsia="Calibri" w:hAnsi="Calibri"/>
-                <w:sz w:val="18"/>
-                <w:szCs w:val="18"/>
-              </w:rPr>
-              <w:t xml:space="preserve">e-mail + WhatsApp</w:t>
-            </w:r>
-          </w:p>
-        </w:tc>
-        <w:tc>
-          <w:tcPr>
-            <w:tcW w:type="dxa" w:w="3600"/>
-            <w:tcMar>
-              <w:top w:type="dxa" w:w="60"/>
-              <w:left w:type="dxa" w:w="90"/>
-              <w:bottom w:type="dxa" w:w="60"/>
-              <w:right w:type="dxa" w:w="90"/>
-            </w:tcMar>
-          </w:tcPr>
-          <w:p>
-            <w:pPr>
-              <w:spacing w:after="40"/>
-            </w:pPr>
-            <w:r>
-              <w:rPr>
-                <w:rFonts w:ascii="Calibri" w:cs="Calibri" w:eastAsia="Calibri" w:hAnsi="Calibri"/>
-                <w:sz w:val="18"/>
-                <w:szCs w:val="18"/>
-              </w:rPr>
-              <w:t xml:space="preserve">C1 Últimos dias (todos os lotes)</w:t>
-            </w:r>
-          </w:p>
-        </w:tc>
-        <w:tc>
-          <w:tcPr>
-            <w:tcW w:type="dxa" w:w="3070"/>
+              <w:t xml:space="preserve">23/10</w:t>
+            </w:r>
+          </w:p>
+        </w:tc>
+        <w:tc>
+          <w:tcPr>
+            <w:tcW w:type="dxa" w:w="4200"/>
             <w:tcMar>
               <w:top w:type="dxa" w:w="60"/>
               <w:left w:type="dxa" w:w="90"/>
@@ -2997,6 +2585,67 @@
                 <w:szCs w:val="18"/>
               </w:rPr>
               <w:t xml:space="preserve">—</w:t>
+            </w:r>
+          </w:p>
+        </w:tc>
+        <w:tc>
+          <w:tcPr>
+            <w:tcW w:type="dxa" w:w="4500"/>
+            <w:tcMar>
+              <w:top w:type="dxa" w:w="60"/>
+              <w:left w:type="dxa" w:w="90"/>
+              <w:bottom w:type="dxa" w:w="60"/>
+              <w:right w:type="dxa" w:w="90"/>
+            </w:tcMar>
+          </w:tcPr>
+          <w:p>
+            <w:pPr>
+              <w:spacing w:after="40"/>
+            </w:pPr>
+            <w:r>
+              <w:rPr>
+                <w:rFonts w:ascii="Calibri" w:cs="Calibri" w:eastAsia="Calibri" w:hAnsi="Calibri"/>
+                <w:sz w:val="18"/>
+                <w:szCs w:val="18"/>
+              </w:rPr>
+              <w:t xml:space="preserve">—</w:t>
+            </w:r>
+          </w:p>
+        </w:tc>
+        <w:tc>
+          <w:tcPr>
+            <w:tcW w:type="dxa" w:w="4570"/>
+            <w:tcMar>
+              <w:top w:type="dxa" w:w="60"/>
+              <w:left w:type="dxa" w:w="90"/>
+              <w:bottom w:type="dxa" w:w="60"/>
+              <w:right w:type="dxa" w:w="90"/>
+            </w:tcMar>
+          </w:tcPr>
+          <w:p>
+            <w:pPr>
+              <w:spacing w:after="40"/>
+            </w:pPr>
+            <w:r>
+              <w:rPr>
+                <w:rFonts w:ascii="Calibri" w:cs="Calibri" w:eastAsia="Calibri" w:hAnsi="Calibri"/>
+                <w:sz w:val="18"/>
+                <w:szCs w:val="18"/>
+              </w:rPr>
+              <w:t xml:space="preserve">Pré-certificação + datas</w:t>
+            </w:r>
+          </w:p>
+          <w:p>
+            <w:pPr>
+              <w:spacing w:after="40"/>
+            </w:pPr>
+            <w:r>
+              <w:rPr>
+                <w:rFonts w:ascii="Calibri" w:cs="Calibri" w:eastAsia="Calibri" w:hAnsi="Calibri"/>
+                <w:sz w:val="18"/>
+                <w:szCs w:val="18"/>
+              </w:rPr>
+              <w:t xml:space="preserve">e-mail · WhatsApp só para quem já conhece a Mind</w:t>
             </w:r>
           </w:p>
         </w:tc>
@@ -3029,25 +2678,25 @@
         </w:tc>
         <w:tc>
           <w:tcPr>
-            <w:tcW w:type="dxa" w:w="3200"/>
-            <w:tcMar>
-              <w:top w:type="dxa" w:w="60"/>
-              <w:left w:type="dxa" w:w="90"/>
-              <w:bottom w:type="dxa" w:w="60"/>
-              <w:right w:type="dxa" w:w="90"/>
-            </w:tcMar>
-          </w:tcPr>
-          <w:p>
-            <w:pPr>
-              <w:spacing w:after="40"/>
-            </w:pPr>
-            <w:r>
-              <w:rPr>
-                <w:rFonts w:ascii="Calibri" w:cs="Calibri" w:eastAsia="Calibri" w:hAnsi="Calibri"/>
-                <w:sz w:val="18"/>
-                <w:szCs w:val="18"/>
-              </w:rPr>
-              <w:t xml:space="preserve">C2 · Último dia</w:t>
+            <w:tcW w:type="dxa" w:w="4200"/>
+            <w:tcMar>
+              <w:top w:type="dxa" w:w="60"/>
+              <w:left w:type="dxa" w:w="90"/>
+              <w:bottom w:type="dxa" w:w="60"/>
+              <w:right w:type="dxa" w:w="90"/>
+            </w:tcMar>
+          </w:tcPr>
+          <w:p>
+            <w:pPr>
+              <w:spacing w:after="40"/>
+            </w:pPr>
+            <w:r>
+              <w:rPr>
+                <w:rFonts w:ascii="Calibri" w:cs="Calibri" w:eastAsia="Calibri" w:hAnsi="Calibri"/>
+                <w:sz w:val="18"/>
+                <w:szCs w:val="18"/>
+              </w:rPr>
+              <w:t xml:space="preserve">Ajudar a escolher</w:t>
             </w:r>
           </w:p>
           <w:p>
@@ -3066,25 +2715,25 @@
         </w:tc>
         <w:tc>
           <w:tcPr>
-            <w:tcW w:type="dxa" w:w="3400"/>
-            <w:tcMar>
-              <w:top w:type="dxa" w:w="60"/>
-              <w:left w:type="dxa" w:w="90"/>
-              <w:bottom w:type="dxa" w:w="60"/>
-              <w:right w:type="dxa" w:w="90"/>
-            </w:tcMar>
-          </w:tcPr>
-          <w:p>
-            <w:pPr>
-              <w:spacing w:after="40"/>
-            </w:pPr>
-            <w:r>
-              <w:rPr>
-                <w:rFonts w:ascii="Calibri" w:cs="Calibri" w:eastAsia="Calibri" w:hAnsi="Calibri"/>
-                <w:sz w:val="18"/>
-                <w:szCs w:val="18"/>
-              </w:rPr>
-              <w:t xml:space="preserve">Consultiva · Último dia</w:t>
+            <w:tcW w:type="dxa" w:w="4500"/>
+            <w:tcMar>
+              <w:top w:type="dxa" w:w="60"/>
+              <w:left w:type="dxa" w:w="90"/>
+              <w:bottom w:type="dxa" w:w="60"/>
+              <w:right w:type="dxa" w:w="90"/>
+            </w:tcMar>
+          </w:tcPr>
+          <w:p>
+            <w:pPr>
+              <w:spacing w:after="40"/>
+            </w:pPr>
+            <w:r>
+              <w:rPr>
+                <w:rFonts w:ascii="Calibri" w:cs="Calibri" w:eastAsia="Calibri" w:hAnsi="Calibri"/>
+                <w:sz w:val="18"/>
+                <w:szCs w:val="18"/>
+              </w:rPr>
+              <w:t xml:space="preserve">Ajudar a escolher</w:t>
             </w:r>
           </w:p>
           <w:p>
@@ -3103,31 +2752,7 @@
         </w:tc>
         <w:tc>
           <w:tcPr>
-            <w:tcW w:type="dxa" w:w="3600"/>
-            <w:tcMar>
-              <w:top w:type="dxa" w:w="60"/>
-              <w:left w:type="dxa" w:w="90"/>
-              <w:bottom w:type="dxa" w:w="60"/>
-              <w:right w:type="dxa" w:w="90"/>
-            </w:tcMar>
-          </w:tcPr>
-          <w:p>
-            <w:pPr>
-              <w:spacing w:after="40"/>
-            </w:pPr>
-            <w:r>
-              <w:rPr>
-                <w:rFonts w:ascii="Calibri" w:cs="Calibri" w:eastAsia="Calibri" w:hAnsi="Calibri"/>
-                <w:sz w:val="18"/>
-                <w:szCs w:val="18"/>
-              </w:rPr>
-              <w:t xml:space="preserve">C1 Último dia (todos os lotes)</w:t>
-            </w:r>
-          </w:p>
-        </w:tc>
-        <w:tc>
-          <w:tcPr>
-            <w:tcW w:type="dxa" w:w="3070"/>
+            <w:tcW w:type="dxa" w:w="4570"/>
             <w:tcMar>
               <w:top w:type="dxa" w:w="60"/>
               <w:left w:type="dxa" w:w="90"/>
@@ -3146,11 +2771,302 @@
                 <w:szCs w:val="18"/>
               </w:rPr>
               <w:t xml:space="preserve">—</w:t>
+            </w:r>
+          </w:p>
+        </w:tc>
+      </w:tr>
+      <w:tr>
+        <w:tc>
+          <w:tcPr>
+            <w:tcW w:type="dxa" w:w="1300"/>
+            <w:shd w:fill="DCE6F1" w:color="auto" w:val="clear"/>
+            <w:tcMar>
+              <w:top w:type="dxa" w:w="60"/>
+              <w:left w:type="dxa" w:w="90"/>
+              <w:bottom w:type="dxa" w:w="60"/>
+              <w:right w:type="dxa" w:w="90"/>
+            </w:tcMar>
+          </w:tcPr>
+          <w:p>
+            <w:pPr>
+              <w:spacing w:after="40"/>
+            </w:pPr>
+            <w:r>
+              <w:rPr>
+                <w:rFonts w:ascii="Calibri" w:cs="Calibri" w:eastAsia="Calibri" w:hAnsi="Calibri"/>
+                <w:sz w:val="18"/>
+                <w:szCs w:val="18"/>
+              </w:rPr>
+              <w:t xml:space="preserve">30/10</w:t>
+            </w:r>
+          </w:p>
+        </w:tc>
+        <w:tc>
+          <w:tcPr>
+            <w:tcW w:type="dxa" w:w="4200"/>
+            <w:tcMar>
+              <w:top w:type="dxa" w:w="60"/>
+              <w:left w:type="dxa" w:w="90"/>
+              <w:bottom w:type="dxa" w:w="60"/>
+              <w:right w:type="dxa" w:w="90"/>
+            </w:tcMar>
+          </w:tcPr>
+          <w:p>
+            <w:pPr>
+              <w:spacing w:after="40"/>
+            </w:pPr>
+            <w:r>
+              <w:rPr>
+                <w:rFonts w:ascii="Calibri" w:cs="Calibri" w:eastAsia="Calibri" w:hAnsi="Calibri"/>
+                <w:sz w:val="18"/>
+                <w:szCs w:val="18"/>
+              </w:rPr>
+              <w:t xml:space="preserve">Reta final</w:t>
+            </w:r>
+          </w:p>
+          <w:p>
+            <w:pPr>
+              <w:spacing w:after="40"/>
+            </w:pPr>
+            <w:r>
+              <w:rPr>
+                <w:rFonts w:ascii="Calibri" w:cs="Calibri" w:eastAsia="Calibri" w:hAnsi="Calibri"/>
+                <w:sz w:val="18"/>
+                <w:szCs w:val="18"/>
+              </w:rPr>
+              <w:t xml:space="preserve">e-mail + WhatsApp</w:t>
+            </w:r>
+          </w:p>
+        </w:tc>
+        <w:tc>
+          <w:tcPr>
+            <w:tcW w:type="dxa" w:w="4500"/>
+            <w:tcMar>
+              <w:top w:type="dxa" w:w="60"/>
+              <w:left w:type="dxa" w:w="90"/>
+              <w:bottom w:type="dxa" w:w="60"/>
+              <w:right w:type="dxa" w:w="90"/>
+            </w:tcMar>
+          </w:tcPr>
+          <w:p>
+            <w:pPr>
+              <w:spacing w:after="40"/>
+            </w:pPr>
+            <w:r>
+              <w:rPr>
+                <w:rFonts w:ascii="Calibri" w:cs="Calibri" w:eastAsia="Calibri" w:hAnsi="Calibri"/>
+                <w:sz w:val="18"/>
+                <w:szCs w:val="18"/>
+              </w:rPr>
+              <w:t xml:space="preserve">Reta final</w:t>
+            </w:r>
+          </w:p>
+          <w:p>
+            <w:pPr>
+              <w:spacing w:after="40"/>
+            </w:pPr>
+            <w:r>
+              <w:rPr>
+                <w:rFonts w:ascii="Calibri" w:cs="Calibri" w:eastAsia="Calibri" w:hAnsi="Calibri"/>
+                <w:sz w:val="18"/>
+                <w:szCs w:val="18"/>
+              </w:rPr>
+              <w:t xml:space="preserve">e-mail + WhatsApp</w:t>
+            </w:r>
+          </w:p>
+        </w:tc>
+        <w:tc>
+          <w:tcPr>
+            <w:tcW w:type="dxa" w:w="4570"/>
+            <w:tcMar>
+              <w:top w:type="dxa" w:w="60"/>
+              <w:left w:type="dxa" w:w="90"/>
+              <w:bottom w:type="dxa" w:w="60"/>
+              <w:right w:type="dxa" w:w="90"/>
+            </w:tcMar>
+          </w:tcPr>
+          <w:p>
+            <w:pPr>
+              <w:spacing w:after="40"/>
+            </w:pPr>
+            <w:r>
+              <w:rPr>
+                <w:rFonts w:ascii="Calibri" w:cs="Calibri" w:eastAsia="Calibri" w:hAnsi="Calibri"/>
+                <w:sz w:val="18"/>
+                <w:szCs w:val="18"/>
+              </w:rPr>
+              <w:t xml:space="preserve">Escolha + proximidade</w:t>
+            </w:r>
+          </w:p>
+          <w:p>
+            <w:pPr>
+              <w:spacing w:after="40"/>
+            </w:pPr>
+            <w:r>
+              <w:rPr>
+                <w:rFonts w:ascii="Calibri" w:cs="Calibri" w:eastAsia="Calibri" w:hAnsi="Calibri"/>
+                <w:sz w:val="18"/>
+                <w:szCs w:val="18"/>
+              </w:rPr>
+              <w:t xml:space="preserve">e-mail · WhatsApp só para quem já conhece a Mind</w:t>
+            </w:r>
+          </w:p>
+        </w:tc>
+      </w:tr>
+      <w:tr>
+        <w:tc>
+          <w:tcPr>
+            <w:tcW w:type="dxa" w:w="1300"/>
+            <w:shd w:fill="DCE6F1" w:color="auto" w:val="clear"/>
+            <w:tcMar>
+              <w:top w:type="dxa" w:w="60"/>
+              <w:left w:type="dxa" w:w="90"/>
+              <w:bottom w:type="dxa" w:w="60"/>
+              <w:right w:type="dxa" w:w="90"/>
+            </w:tcMar>
+          </w:tcPr>
+          <w:p>
+            <w:pPr>
+              <w:spacing w:after="40"/>
+            </w:pPr>
+            <w:r>
+              <w:rPr>
+                <w:rFonts w:ascii="Calibri" w:cs="Calibri" w:eastAsia="Calibri" w:hAnsi="Calibri"/>
+                <w:sz w:val="18"/>
+                <w:szCs w:val="18"/>
+              </w:rPr>
+              <w:t xml:space="preserve">02/11</w:t>
+            </w:r>
+          </w:p>
+        </w:tc>
+        <w:tc>
+          <w:tcPr>
+            <w:tcW w:type="dxa" w:w="4200"/>
+            <w:tcMar>
+              <w:top w:type="dxa" w:w="60"/>
+              <w:left w:type="dxa" w:w="90"/>
+              <w:bottom w:type="dxa" w:w="60"/>
+              <w:right w:type="dxa" w:w="90"/>
+            </w:tcMar>
+          </w:tcPr>
+          <w:p>
+            <w:pPr>
+              <w:spacing w:after="40"/>
+            </w:pPr>
+            <w:r>
+              <w:rPr>
+                <w:rFonts w:ascii="Calibri" w:cs="Calibri" w:eastAsia="Calibri" w:hAnsi="Calibri"/>
+                <w:sz w:val="18"/>
+                <w:szCs w:val="18"/>
+              </w:rPr>
+              <w:t xml:space="preserve">Começa amanhã</w:t>
+            </w:r>
+          </w:p>
+          <w:p>
+            <w:pPr>
+              <w:spacing w:after="40"/>
+            </w:pPr>
+            <w:r>
+              <w:rPr>
+                <w:rFonts w:ascii="Calibri" w:cs="Calibri" w:eastAsia="Calibri" w:hAnsi="Calibri"/>
+                <w:sz w:val="18"/>
+                <w:szCs w:val="18"/>
+              </w:rPr>
+              <w:t xml:space="preserve">e-mail + WhatsApp</w:t>
+            </w:r>
+          </w:p>
+        </w:tc>
+        <w:tc>
+          <w:tcPr>
+            <w:tcW w:type="dxa" w:w="4500"/>
+            <w:tcMar>
+              <w:top w:type="dxa" w:w="60"/>
+              <w:left w:type="dxa" w:w="90"/>
+              <w:bottom w:type="dxa" w:w="60"/>
+              <w:right w:type="dxa" w:w="90"/>
+            </w:tcMar>
+          </w:tcPr>
+          <w:p>
+            <w:pPr>
+              <w:spacing w:after="40"/>
+            </w:pPr>
+            <w:r>
+              <w:rPr>
+                <w:rFonts w:ascii="Calibri" w:cs="Calibri" w:eastAsia="Calibri" w:hAnsi="Calibri"/>
+                <w:sz w:val="18"/>
+                <w:szCs w:val="18"/>
+              </w:rPr>
+              <w:t xml:space="preserve">Começa amanhã</w:t>
+            </w:r>
+          </w:p>
+          <w:p>
+            <w:pPr>
+              <w:spacing w:after="40"/>
+            </w:pPr>
+            <w:r>
+              <w:rPr>
+                <w:rFonts w:ascii="Calibri" w:cs="Calibri" w:eastAsia="Calibri" w:hAnsi="Calibri"/>
+                <w:sz w:val="18"/>
+                <w:szCs w:val="18"/>
+              </w:rPr>
+              <w:t xml:space="preserve">e-mail + WhatsApp</w:t>
+            </w:r>
+          </w:p>
+        </w:tc>
+        <w:tc>
+          <w:tcPr>
+            <w:tcW w:type="dxa" w:w="4570"/>
+            <w:tcMar>
+              <w:top w:type="dxa" w:w="60"/>
+              <w:left w:type="dxa" w:w="90"/>
+              <w:bottom w:type="dxa" w:w="60"/>
+              <w:right w:type="dxa" w:w="90"/>
+            </w:tcMar>
+          </w:tcPr>
+          <w:p>
+            <w:pPr>
+              <w:spacing w:after="40"/>
+            </w:pPr>
+            <w:r>
+              <w:rPr>
+                <w:rFonts w:ascii="Calibri" w:cs="Calibri" w:eastAsia="Calibri" w:hAnsi="Calibri"/>
+                <w:sz w:val="18"/>
+                <w:szCs w:val="18"/>
+              </w:rPr>
+              <w:t xml:space="preserve">Começa amanhã</w:t>
+            </w:r>
+          </w:p>
+          <w:p>
+            <w:pPr>
+              <w:spacing w:after="40"/>
+            </w:pPr>
+            <w:r>
+              <w:rPr>
+                <w:rFonts w:ascii="Calibri" w:cs="Calibri" w:eastAsia="Calibri" w:hAnsi="Calibri"/>
+                <w:sz w:val="18"/>
+                <w:szCs w:val="18"/>
+              </w:rPr>
+              <w:t xml:space="preserve">e-mail · WhatsApp só para quem já conhece a Mind</w:t>
             </w:r>
           </w:p>
         </w:tc>
       </w:tr>
     </w:tbl>
+    <w:p>
+      <w:pPr>
+        <w:spacing w:after="100"/>
+      </w:pPr>
+      <w:r>
+        <w:rPr>
+          <w:rFonts w:ascii="Calibri" w:cs="Calibri" w:eastAsia="Calibri" w:hAnsi="Calibri"/>
+          <w:b/>
+          <w:bCs/>
+          <w:sz w:val="18"/>
+          <w:szCs w:val="18"/>
+        </w:rPr>
+        <w:t xml:space="preserve">Ajuste de 16/10: na Lista 2 (Lead quente), a apresentação da pré-certificação foi antecipada de 20/10 para 16/10. As Listas 1 e 3 seguem o calendário original.</w:t>
+      </w:r>
+    </w:p>
     <w:p>
       <w:pPr>
         <w:spacing w:after="100"/>

</xml_diff>